<commit_message>
merge codeblocks that follow each other
People might use paragraphs instead of newlines for code blocks. We
merge those.
</commit_message>
<xml_diff>
--- a/_test/EndToEnd/codeblock.docx
+++ b/_test/EndToEnd/codeblock.docx
@@ -96,20 +96,101 @@
         <w:spacing w:after="160" w:before="0" w:line="276" w:lineRule="auto"/>
         <w:ind w:left="0" w:right="0" w:firstLine="0"/>
         <w:jc w:val="left"/>
-        <w:rPr>
-          <w:rFonts w:ascii="Aptos" w:cs="Aptos" w:eastAsia="Aptos" w:hAnsi="Aptos"/>
-          <w:b w:val="0"/>
-          <w:i w:val="0"/>
-          <w:smallCaps w:val="0"/>
-          <w:strike w:val="0"/>
-          <w:color w:val="000000"/>
-          <w:sz w:val="24"/>
-          <w:szCs w:val="24"/>
-          <w:u w:val="none"/>
-          <w:shd w:fill="auto" w:val="clear"/>
-          <w:vertAlign w:val="baseline"/>
-        </w:rPr>
+        <w:rPr/>
       </w:pPr>
+      <w:r>
+        <w:rPr>
+          <w:rtl w:val="0"/>
+        </w:rPr>
+        <w:t xml:space="preserve">Now some doc block paragraphs that should be joined</w:t>
+      </w:r>
+    </w:p>
+    <w:p>
+      <w:pPr>
+        <w:keepNext w:val="0"/>
+        <w:keepLines w:val="0"/>
+        <w:pageBreakBefore w:val="0"/>
+        <w:widowControl w:val="1"/>
+        <w:pBdr>
+          <w:top w:space="0" w:sz="0" w:val="nil"/>
+          <w:left w:space="0" w:sz="0" w:val="nil"/>
+          <w:bottom w:space="0" w:sz="0" w:val="nil"/>
+          <w:right w:space="0" w:sz="0" w:val="nil"/>
+          <w:between w:space="0" w:sz="0" w:val="nil"/>
+        </w:pBdr>
+        <w:shd w:fill="auto" w:val="clear"/>
+        <w:spacing w:after="160" w:before="0" w:line="276" w:lineRule="auto"/>
+        <w:ind w:left="0" w:right="0" w:firstLine="0"/>
+        <w:jc w:val="left"/>
+        <w:rPr>
+          <w:rFonts w:ascii="Courier New" w:cs="Courier New" w:eastAsia="Courier New" w:hAnsi="Courier New"/>
+        </w:rPr>
+      </w:pPr>
+      <w:r>
+        <w:rPr>
+          <w:rFonts w:ascii="Courier New" w:cs="Courier New" w:eastAsia="Courier New" w:hAnsi="Courier New"/>
+          <w:rtl w:val="0"/>
+        </w:rPr>
+        <w:t xml:space="preserve">first line</w:t>
+      </w:r>
+    </w:p>
+    <w:p>
+      <w:pPr>
+        <w:keepNext w:val="0"/>
+        <w:keepLines w:val="0"/>
+        <w:pageBreakBefore w:val="0"/>
+        <w:widowControl w:val="1"/>
+        <w:pBdr>
+          <w:top w:space="0" w:sz="0" w:val="nil"/>
+          <w:left w:space="0" w:sz="0" w:val="nil"/>
+          <w:bottom w:space="0" w:sz="0" w:val="nil"/>
+          <w:right w:space="0" w:sz="0" w:val="nil"/>
+          <w:between w:space="0" w:sz="0" w:val="nil"/>
+        </w:pBdr>
+        <w:shd w:fill="auto" w:val="clear"/>
+        <w:spacing w:after="160" w:before="0" w:line="276" w:lineRule="auto"/>
+        <w:ind w:left="0" w:right="0" w:firstLine="0"/>
+        <w:jc w:val="left"/>
+        <w:rPr>
+          <w:rFonts w:ascii="Courier New" w:cs="Courier New" w:eastAsia="Courier New" w:hAnsi="Courier New"/>
+        </w:rPr>
+      </w:pPr>
+      <w:r>
+        <w:rPr>
+          <w:rFonts w:ascii="Courier New" w:cs="Courier New" w:eastAsia="Courier New" w:hAnsi="Courier New"/>
+          <w:rtl w:val="0"/>
+        </w:rPr>
+        <w:t xml:space="preserve">second line</w:t>
+      </w:r>
+    </w:p>
+    <w:p>
+      <w:pPr>
+        <w:keepNext w:val="0"/>
+        <w:keepLines w:val="0"/>
+        <w:pageBreakBefore w:val="0"/>
+        <w:widowControl w:val="1"/>
+        <w:pBdr>
+          <w:top w:space="0" w:sz="0" w:val="nil"/>
+          <w:left w:space="0" w:sz="0" w:val="nil"/>
+          <w:bottom w:space="0" w:sz="0" w:val="nil"/>
+          <w:right w:space="0" w:sz="0" w:val="nil"/>
+          <w:between w:space="0" w:sz="0" w:val="nil"/>
+        </w:pBdr>
+        <w:shd w:fill="auto" w:val="clear"/>
+        <w:spacing w:after="160" w:before="0" w:line="276" w:lineRule="auto"/>
+        <w:ind w:left="0" w:right="0" w:firstLine="0"/>
+        <w:jc w:val="left"/>
+        <w:rPr>
+          <w:rFonts w:ascii="Courier New" w:cs="Courier New" w:eastAsia="Courier New" w:hAnsi="Courier New"/>
+        </w:rPr>
+      </w:pPr>
+      <w:r>
+        <w:rPr>
+          <w:rFonts w:ascii="Courier New" w:cs="Courier New" w:eastAsia="Courier New" w:hAnsi="Courier New"/>
+          <w:rtl w:val="0"/>
+        </w:rPr>
+        <w:t xml:space="preserve">third line</w:t>
+      </w:r>
       <w:r>
         <w:rPr>
           <w:rtl w:val="0"/>
@@ -254,6 +335,113 @@
     </w:rPr>
   </w:style>
   <w:style w:type="paragraph" w:styleId="Normal" w:default="1">
+    <w:name w:val="normal"/>
+  </w:style>
+  <w:style w:type="table" w:styleId="TableNormal" w:default="1">
+    <w:name w:val="Table Normal"/>
+  </w:style>
+  <w:style w:type="paragraph" w:styleId="Heading1">
+    <w:name w:val="heading 1"/>
+    <w:basedOn w:val="Normal"/>
+    <w:next w:val="Normal"/>
+    <w:pPr>
+      <w:keepNext w:val="1"/>
+      <w:keepLines w:val="1"/>
+      <w:spacing w:after="80" w:before="360" w:lineRule="auto"/>
+    </w:pPr>
+    <w:rPr>
+      <w:rFonts w:ascii="Play" w:cs="Play" w:eastAsia="Play" w:hAnsi="Play"/>
+      <w:color w:val="0f4761"/>
+      <w:sz w:val="40"/>
+      <w:szCs w:val="40"/>
+    </w:rPr>
+  </w:style>
+  <w:style w:type="paragraph" w:styleId="Heading2">
+    <w:name w:val="heading 2"/>
+    <w:basedOn w:val="Normal"/>
+    <w:next w:val="Normal"/>
+    <w:pPr>
+      <w:keepNext w:val="1"/>
+      <w:keepLines w:val="1"/>
+      <w:spacing w:after="80" w:before="160" w:lineRule="auto"/>
+    </w:pPr>
+    <w:rPr>
+      <w:rFonts w:ascii="Play" w:cs="Play" w:eastAsia="Play" w:hAnsi="Play"/>
+      <w:color w:val="0f4761"/>
+      <w:sz w:val="32"/>
+      <w:szCs w:val="32"/>
+    </w:rPr>
+  </w:style>
+  <w:style w:type="paragraph" w:styleId="Heading3">
+    <w:name w:val="heading 3"/>
+    <w:basedOn w:val="Normal"/>
+    <w:next w:val="Normal"/>
+    <w:pPr>
+      <w:keepNext w:val="1"/>
+      <w:keepLines w:val="1"/>
+      <w:spacing w:after="80" w:before="160" w:lineRule="auto"/>
+    </w:pPr>
+    <w:rPr>
+      <w:color w:val="0f4761"/>
+      <w:sz w:val="28"/>
+      <w:szCs w:val="28"/>
+    </w:rPr>
+  </w:style>
+  <w:style w:type="paragraph" w:styleId="Heading4">
+    <w:name w:val="heading 4"/>
+    <w:basedOn w:val="Normal"/>
+    <w:next w:val="Normal"/>
+    <w:pPr>
+      <w:keepNext w:val="1"/>
+      <w:keepLines w:val="1"/>
+      <w:spacing w:after="40" w:before="80" w:lineRule="auto"/>
+    </w:pPr>
+    <w:rPr>
+      <w:i w:val="1"/>
+      <w:color w:val="0f4761"/>
+    </w:rPr>
+  </w:style>
+  <w:style w:type="paragraph" w:styleId="Heading5">
+    <w:name w:val="heading 5"/>
+    <w:basedOn w:val="Normal"/>
+    <w:next w:val="Normal"/>
+    <w:pPr>
+      <w:keepNext w:val="1"/>
+      <w:keepLines w:val="1"/>
+      <w:spacing w:after="40" w:before="80" w:lineRule="auto"/>
+    </w:pPr>
+    <w:rPr>
+      <w:color w:val="0f4761"/>
+    </w:rPr>
+  </w:style>
+  <w:style w:type="paragraph" w:styleId="Heading6">
+    <w:name w:val="heading 6"/>
+    <w:basedOn w:val="Normal"/>
+    <w:next w:val="Normal"/>
+    <w:pPr>
+      <w:keepNext w:val="1"/>
+      <w:keepLines w:val="1"/>
+      <w:spacing w:after="0" w:before="40" w:lineRule="auto"/>
+    </w:pPr>
+    <w:rPr>
+      <w:i w:val="1"/>
+      <w:color w:val="595959"/>
+    </w:rPr>
+  </w:style>
+  <w:style w:type="paragraph" w:styleId="Title">
+    <w:name w:val="Title"/>
+    <w:basedOn w:val="Normal"/>
+    <w:next w:val="Normal"/>
+    <w:pPr>
+      <w:spacing w:after="80" w:before="0" w:line="240" w:lineRule="auto"/>
+    </w:pPr>
+    <w:rPr>
+      <w:rFonts w:ascii="Play" w:cs="Play" w:eastAsia="Play" w:hAnsi="Play"/>
+      <w:sz w:val="56"/>
+      <w:szCs w:val="56"/>
+    </w:rPr>
+  </w:style>
+  <w:style w:type="paragraph" w:styleId="Normal" w:default="1">
     <w:name w:val="Normal"/>
     <w:qFormat w:val="1"/>
     <w:pPr>
@@ -887,6 +1075,17 @@
         <w:right w:w="108.0" w:type="dxa"/>
       </w:tblCellMar>
     </w:tblPr>
+  </w:style>
+  <w:style w:type="paragraph" w:styleId="Subtitle">
+    <w:name w:val="Subtitle"/>
+    <w:basedOn w:val="Normal"/>
+    <w:next w:val="Normal"/>
+    <w:pPr/>
+    <w:rPr>
+      <w:color w:val="595959"/>
+      <w:sz w:val="28"/>
+      <w:szCs w:val="28"/>
+    </w:rPr>
   </w:style>
   <w:style w:type="paragraph" w:styleId="Subtitle">
     <w:name w:val="Subtitle"/>

</xml_diff>